<commit_message>
Actualiza la documentación y el README con el nuevo catálogo
</commit_message>
<xml_diff>
--- a/docs/documentacion-tecnica.docx
+++ b/docs/documentacion-tecnica.docx
@@ -98,7 +98,7 @@
         <w:pStyle w:val="FirstParagraph"/>
       </w:pPr>
       <w:r>
-        <w:t xml:space="preserve">Electro Banfield es una tienda online de electrónica (celulares, computación, audio, TV, gaming, hogar inteligente y accesorios). Tiene dos partes:</w:t>
+        <w:t xml:space="preserve">Electro Banfield es una tienda online de electrónica (smartphones, notebooks, tablets, audio, smartwatches, TV y monitores, gaming y accesorios, con 38 productos de marcas como Samsung, Apple, Sony, LG, Logitech y JBL). Tiene dos partes:</w:t>
       </w:r>
     </w:p>
     <w:p>
@@ -1246,7 +1246,7 @@
         <w:t xml:space="preserve"> </w:t>
       </w:r>
       <w:r>
-        <w:t xml:space="preserve">Cada producto puede tener versiones (capacidad, pulgadas) y colores. Si las tiene, el cliente debe elegir una al comprar.</w:t>
+        <w:t xml:space="preserve">Cada producto puede tener versiones (capacidad, pulgadas) y colores. Si las tiene, el cliente debe elegir una al comprar. El catálogo actual no usa versiones ni colores, pero el sistema los soporta y se cargan desde el panel.</w:t>
       </w:r>
     </w:p>
     <w:p>
@@ -5357,7 +5357,7 @@
         <w:pStyle w:val="Compact"/>
       </w:pPr>
       <w:r>
-        <w:t xml:space="preserve">Los datos de contacto, la sucursal y las marcas del catálogo son ejemplos.</w:t>
+        <w:t xml:space="preserve">Los datos de contacto y la sucursal son ejemplos, y el costo de cada producto es un valor de demostración (la lista de productos trae precio, descuento y stock, pero no el costo).</w:t>
       </w:r>
     </w:p>
     <w:bookmarkEnd w:id="37"/>

</xml_diff>

<commit_message>
Documenta que los precios de los productos nuevos son de referencia
</commit_message>
<xml_diff>
--- a/docs/documentacion-tecnica.docx
+++ b/docs/documentacion-tecnica.docx
@@ -5346,6 +5346,18 @@
       </w:pPr>
       <w:r>
         <w:t xml:space="preserve">Las cuentas de clientes no tienen recuperación de contraseña.</w:t>
+      </w:r>
+    </w:p>
+    <w:p>
+      <w:pPr>
+        <w:numPr>
+          <w:ilvl w:val="0"/>
+          <w:numId w:val="1008"/>
+        </w:numPr>
+        <w:pStyle w:val="Compact"/>
+      </w:pPr>
+      <w:r>
+        <w:t xml:space="preserve">Los precios de los últimos 7 productos del catálogo son de referencia (basados en publicaciones de tiendas y estimaciones) y su stock es de ejemplo; hay que confirmarlos antes de vender.</w:t>
       </w:r>
     </w:p>
     <w:p>

</xml_diff>

<commit_message>
Actualiza el nombre a Nexo Tech en el servidor, la base de datos, el README y la documentación
</commit_message>
<xml_diff>
--- a/docs/documentacion-tecnica.docx
+++ b/docs/documentacion-tecnica.docx
@@ -7,13 +7,13 @@
         <w:pStyle w:val="Title"/>
       </w:pPr>
       <w:r>
-        <w:t xml:space="preserve">Electro</w:t>
-      </w:r>
-      <w:r>
-        <w:t xml:space="preserve"> </w:t>
-      </w:r>
-      <w:r>
-        <w:t xml:space="preserve">Banfield</w:t>
+        <w:t xml:space="preserve">Nexo</w:t>
+      </w:r>
+      <w:r>
+        <w:t xml:space="preserve"> </w:t>
+      </w:r>
+      <w:r>
+        <w:t xml:space="preserve">Tech</w:t>
       </w:r>
       <w:r>
         <w:t xml:space="preserve"> </w:t>
@@ -98,7 +98,7 @@
         <w:pStyle w:val="FirstParagraph"/>
       </w:pPr>
       <w:r>
-        <w:t xml:space="preserve">Electro Banfield es una tienda online de electrónica (celulares, notebooks, tablets, audio, smartwatches, TV y monitores, gaming y accesorios, con 38 productos de marcas como Samsung, Apple, Sony, LG, Logitech y JBL). Tiene dos partes:</w:t>
+        <w:t xml:space="preserve">Nexo Tech es una tienda online de electrónica (celulares, notebooks, tablets, audio, smartwatches, TV y monitores, gaming y accesorios, con 38 productos de marcas como Samsung, Apple, Sony, LG, Logitech y JBL). Tiene dos partes:</w:t>
       </w:r>
     </w:p>
     <w:p>

</xml_diff>

<commit_message>
Documenta cómo cargar las imágenes de los productos
</commit_message>
<xml_diff>
--- a/docs/documentacion-tecnica.docx
+++ b/docs/documentacion-tecnica.docx
@@ -1191,6 +1191,52 @@
       </w:r>
       <w:r>
         <w:t xml:space="preserve">. Si después cambia el precio, las ventas anteriores no se alteran.</w:t>
+      </w:r>
+    </w:p>
+    <w:p>
+      <w:pPr>
+        <w:numPr>
+          <w:ilvl w:val="0"/>
+          <w:numId w:val="1003"/>
+        </w:numPr>
+        <w:pStyle w:val="Compact"/>
+      </w:pPr>
+      <w:r>
+        <w:rPr>
+          <w:bCs/>
+          <w:b/>
+        </w:rPr>
+        <w:t xml:space="preserve">Imágenes.</w:t>
+      </w:r>
+      <w:r>
+        <w:t xml:space="preserve"> </w:t>
+      </w:r>
+      <w:r>
+        <w:t xml:space="preserve">Cada producto puede tener una imagen (PNG, JPG, WEBP o GIF de hasta 300 KB). El servidor guarda el archivo en la carpeta</w:t>
+      </w:r>
+      <w:r>
+        <w:t xml:space="preserve"> </w:t>
+      </w:r>
+      <w:r>
+        <w:rPr>
+          <w:rStyle w:val="VerbatimChar"/>
+        </w:rPr>
+        <w:t xml:space="preserve">uploads/</w:t>
+      </w:r>
+      <w:r>
+        <w:t xml:space="preserve"> </w:t>
+      </w:r>
+      <w:r>
+        <w:t xml:space="preserve">y en la base queda solo su dirección (</w:t>
+      </w:r>
+      <w:r>
+        <w:rPr>
+          <w:rStyle w:val="VerbatimChar"/>
+        </w:rPr>
+        <w:t xml:space="preserve">ImagenUrl</w:t>
+      </w:r>
+      <w:r>
+        <w:t xml:space="preserve">). Si el producto no tiene imagen, se muestra un ícono.</w:t>
       </w:r>
     </w:p>
     <w:p>

</xml_diff>

<commit_message>
Documenta el pago simulado y actualiza el diagrama de la base de datos
</commit_message>
<xml_diff>
--- a/docs/documentacion-tecnica.docx
+++ b/docs/documentacion-tecnica.docx
@@ -415,7 +415,20 @@
         <w:pStyle w:val="BodyText"/>
       </w:pPr>
       <w:r>
-        <w:t xml:space="preserve">Además: estados de pedido, favoritos, cuentas opcionales de clientes, botón de arrepentimiento, newsletter y una sección de ganancias para el dueño.</w:t>
+        <w:t xml:space="preserve">Además: estados de pedido, favoritos, cuentas opcionales de clientes,</w:t>
+      </w:r>
+      <w:r>
+        <w:t xml:space="preserve"> </w:t>
+      </w:r>
+      <w:r>
+        <w:rPr>
+          <w:bCs/>
+          <w:b/>
+        </w:rPr>
+        <w:t xml:space="preserve">pago con tarjeta simulado</w:t>
+      </w:r>
+      <w:r>
+        <w:t xml:space="preserve">, botón de arrepentimiento, newsletter y una sección de ganancias para el dueño.</w:t>
       </w:r>
     </w:p>
     <w:bookmarkEnd w:id="20"/>
@@ -703,7 +716,7 @@
       <w:r>
         <w:drawing>
           <wp:inline>
-            <wp:extent cx="6120000" cy="3479536"/>
+            <wp:extent cx="6120000" cy="3463214"/>
             <wp:effectExtent b="0" l="0" r="0" t="0"/>
             <wp:docPr descr="Diagrama entidad-relación de la base de datos" title="" id="24" name="Picture"/>
             <a:graphic>
@@ -724,7 +737,7 @@
                   <pic:spPr bwMode="auto">
                     <a:xfrm>
                       <a:off x="0" y="0"/>
-                      <a:ext cx="6120000" cy="3479536"/>
+                      <a:ext cx="6120000" cy="3463214"/>
                     </a:xfrm>
                     <a:prstGeom prst="rect">
                       <a:avLst/>
@@ -1237,6 +1250,98 @@
       </w:r>
       <w:r>
         <w:t xml:space="preserve">). Si el producto no tiene imagen, se muestra un ícono.</w:t>
+      </w:r>
+    </w:p>
+    <w:p>
+      <w:pPr>
+        <w:numPr>
+          <w:ilvl w:val="0"/>
+          <w:numId w:val="1003"/>
+        </w:numPr>
+        <w:pStyle w:val="Compact"/>
+      </w:pPr>
+      <w:r>
+        <w:rPr>
+          <w:bCs/>
+          <w:b/>
+        </w:rPr>
+        <w:t xml:space="preserve">Pago simulado.</w:t>
+      </w:r>
+      <w:r>
+        <w:t xml:space="preserve"> </w:t>
+      </w:r>
+      <w:r>
+        <w:t xml:space="preserve">El pago pide nombre completo, DNI, email, país, ciudad, dirección, código postal, número de tarjeta, vencimiento y CVC. La página valida los datos (el número con el algoritmo de Luhn, el vencimiento y el CVC) y simula la respuesta de una pasarela: la tarjeta</w:t>
+      </w:r>
+      <w:r>
+        <w:t xml:space="preserve"> </w:t>
+      </w:r>
+      <w:r>
+        <w:rPr>
+          <w:rStyle w:val="VerbatimChar"/>
+        </w:rPr>
+        <w:t xml:space="preserve">4111 1111 1111 1111</w:t>
+      </w:r>
+      <w:r>
+        <w:t xml:space="preserve"> </w:t>
+      </w:r>
+      <w:r>
+        <w:t xml:space="preserve">se aprueba, la</w:t>
+      </w:r>
+      <w:r>
+        <w:t xml:space="preserve"> </w:t>
+      </w:r>
+      <w:r>
+        <w:rPr>
+          <w:rStyle w:val="VerbatimChar"/>
+        </w:rPr>
+        <w:t xml:space="preserve">4000 0000 0000 0002</w:t>
+      </w:r>
+      <w:r>
+        <w:t xml:space="preserve"> </w:t>
+      </w:r>
+      <w:r>
+        <w:t xml:space="preserve">se rechaza y la</w:t>
+      </w:r>
+      <w:r>
+        <w:t xml:space="preserve"> </w:t>
+      </w:r>
+      <w:r>
+        <w:rPr>
+          <w:rStyle w:val="VerbatimChar"/>
+        </w:rPr>
+        <w:t xml:space="preserve">4000 0000 0000 9995</w:t>
+      </w:r>
+      <w:r>
+        <w:t xml:space="preserve"> </w:t>
+      </w:r>
+      <w:r>
+        <w:t xml:space="preserve">falla por fondos insuficientes.</w:t>
+      </w:r>
+      <w:r>
+        <w:t xml:space="preserve"> </w:t>
+      </w:r>
+      <w:r>
+        <w:rPr>
+          <w:bCs/>
+          <w:b/>
+        </w:rPr>
+        <w:t xml:space="preserve">El número completo y el CVC nunca se guardan ni se envían al servidor</w:t>
+      </w:r>
+      <w:r>
+        <w:t xml:space="preserve">: del pago solo se guarda la marca y los últimos 4 dígitos. Si el pago se aprueba, el pedido queda en estado</w:t>
+      </w:r>
+      <w:r>
+        <w:t xml:space="preserve"> </w:t>
+      </w:r>
+      <w:r>
+        <w:rPr>
+          <w:rStyle w:val="VerbatimChar"/>
+        </w:rPr>
+        <w:t xml:space="preserve">pagado</w:t>
+      </w:r>
+      <w:r>
+        <w:t xml:space="preserve">; si se rechaza, no se crea el pedido y el carrito se conserva.</w:t>
       </w:r>
     </w:p>
     <w:p>
@@ -3773,6 +3878,9 @@
               </w:rPr>
               <w:t xml:space="preserve">sin cuenta</w:t>
             </w:r>
+            <w:r>
+              <w:t xml:space="preserve">. Recibe los datos del comprador y del pago simulado (marca y últimos 4 dígitos); rechaza cualquier dato de la tarjeta.</w:t>
+            </w:r>
           </w:p>
         </w:tc>
       </w:tr>
@@ -4759,7 +4867,7 @@
               <w:jc w:val="left"/>
             </w:pPr>
             <w:r>
-              <w:t xml:space="preserve">Cabeceras</w:t>
+              <w:t xml:space="preserve">Datos de la tarjeta</w:t>
             </w:r>
           </w:p>
         </w:tc>
@@ -4774,40 +4882,7 @@
               <w:jc w:val="left"/>
             </w:pPr>
             <w:r>
-              <w:rPr>
-                <w:rStyle w:val="VerbatimChar"/>
-              </w:rPr>
-              <w:t xml:space="preserve">Content-Security-Policy</w:t>
-            </w:r>
-            <w:r>
-              <w:t xml:space="preserve">,</w:t>
-            </w:r>
-            <w:r>
-              <w:t xml:space="preserve"> </w:t>
-            </w:r>
-            <w:r>
-              <w:rPr>
-                <w:rStyle w:val="VerbatimChar"/>
-              </w:rPr>
-              <w:t xml:space="preserve">X-Content-Type-Options</w:t>
-            </w:r>
-            <w:r>
-              <w:t xml:space="preserve"> </w:t>
-            </w:r>
-            <w:r>
-              <w:t xml:space="preserve">y</w:t>
-            </w:r>
-            <w:r>
-              <w:t xml:space="preserve"> </w:t>
-            </w:r>
-            <w:r>
-              <w:rPr>
-                <w:rStyle w:val="VerbatimChar"/>
-              </w:rPr>
-              <w:t xml:space="preserve">Referrer-Policy</w:t>
-            </w:r>
-            <w:r>
-              <w:t xml:space="preserve">.</w:t>
+              <w:t xml:space="preserve">El número y el CVC se validan solo en el navegador y no se envían ni se guardan. El servidor rechaza (error 400) cualquier solicitud que los incluya.</w:t>
             </w:r>
           </w:p>
         </w:tc>
@@ -4823,6 +4898,70 @@
               <w:jc w:val="left"/>
             </w:pPr>
             <w:r>
+              <w:t xml:space="preserve">Cabeceras</w:t>
+            </w:r>
+          </w:p>
+        </w:tc>
+        <w:tc>
+          <w:tcPr>
+            <w:tcW w:type="dxa" w:w="6463"/>
+          </w:tcPr>
+          <w:p>
+            <w:pPr>
+              <w:pStyle w:val="Compact"/>
+              <w:jc w:val="left"/>
+            </w:pPr>
+            <w:r>
+              <w:rPr>
+                <w:rStyle w:val="VerbatimChar"/>
+              </w:rPr>
+              <w:t xml:space="preserve">Content-Security-Policy</w:t>
+            </w:r>
+            <w:r>
+              <w:t xml:space="preserve">,</w:t>
+            </w:r>
+            <w:r>
+              <w:t xml:space="preserve"> </w:t>
+            </w:r>
+            <w:r>
+              <w:rPr>
+                <w:rStyle w:val="VerbatimChar"/>
+              </w:rPr>
+              <w:t xml:space="preserve">X-Content-Type-Options</w:t>
+            </w:r>
+            <w:r>
+              <w:t xml:space="preserve"> </w:t>
+            </w:r>
+            <w:r>
+              <w:t xml:space="preserve">y</w:t>
+            </w:r>
+            <w:r>
+              <w:t xml:space="preserve"> </w:t>
+            </w:r>
+            <w:r>
+              <w:rPr>
+                <w:rStyle w:val="VerbatimChar"/>
+              </w:rPr>
+              <w:t xml:space="preserve">Referrer-Policy</w:t>
+            </w:r>
+            <w:r>
+              <w:t xml:space="preserve">.</w:t>
+            </w:r>
+          </w:p>
+        </w:tc>
+      </w:tr>
+      <w:tr>
+        <w:tc>
+          <w:tcPr>
+            <w:tcW w:type="dxa" w:w="3175"/>
+            <w:shd w:val="clear" w:color="auto" w:fill="F1F6F2"/>
+          </w:tcPr>
+          <w:p>
+            <w:pPr>
+              <w:pStyle w:val="Compact"/>
+              <w:jc w:val="left"/>
+            </w:pPr>
+            <w:r>
               <w:t xml:space="preserve">Usuario de base de datos</w:t>
             </w:r>
           </w:p>
@@ -4830,6 +4969,7 @@
         <w:tc>
           <w:tcPr>
             <w:tcW w:type="dxa" w:w="6463"/>
+            <w:shd w:val="clear" w:color="auto" w:fill="F1F6F2"/>
           </w:tcPr>
           <w:p>
             <w:pPr>
@@ -4927,7 +5067,7 @@
         <w:t xml:space="preserve">npm test</w:t>
       </w:r>
       <w:r>
-        <w:t xml:space="preserve">, 13 pruebas). Usan una base de datos simulada, por lo que no necesitan SQL Server. Verifican:</w:t>
+        <w:t xml:space="preserve">, 14 pruebas). Usan una base de datos simulada, por lo que no necesitan SQL Server. Verifican:</w:t>
       </w:r>
     </w:p>
     <w:p>
@@ -4975,7 +5115,7 @@
         <w:pStyle w:val="Compact"/>
       </w:pPr>
       <w:r>
-        <w:t xml:space="preserve">que se pueda comprar sin cuenta y que los datos se validen;</w:t>
+        <w:t xml:space="preserve">que se pueda comprar sin cuenta y que los datos del comprador y del pago se validen;</w:t>
       </w:r>
     </w:p>
     <w:p>
@@ -4987,7 +5127,7 @@
         <w:pStyle w:val="Compact"/>
       </w:pPr>
       <w:r>
-        <w:t xml:space="preserve">el mapeo de los errores de negocio y la ocultación de errores internos;</w:t>
+        <w:t xml:space="preserve">que el servidor rechace cualquier dato de la tarjeta (número, CVC o vencimiento);</w:t>
       </w:r>
     </w:p>
     <w:p>
@@ -4999,6 +5139,18 @@
         <w:pStyle w:val="Compact"/>
       </w:pPr>
       <w:r>
+        <w:t xml:space="preserve">el mapeo de los errores de negocio y la ocultación de errores internos;</w:t>
+      </w:r>
+    </w:p>
+    <w:p>
+      <w:pPr>
+        <w:numPr>
+          <w:ilvl w:val="0"/>
+          <w:numId w:val="1006"/>
+        </w:numPr>
+        <w:pStyle w:val="Compact"/>
+      </w:pPr>
+      <w:r>
         <w:t xml:space="preserve">que no se pueda salir de la carpeta pública.</w:t>
       </w:r>
     </w:p>
@@ -5311,7 +5463,7 @@
         <w:pStyle w:val="Compact"/>
       </w:pPr>
       <w:r>
-        <w:t xml:space="preserve">Falta el</w:t>
+        <w:t xml:space="preserve">El</w:t>
       </w:r>
       <w:r>
         <w:t xml:space="preserve"> </w:t>
@@ -5321,13 +5473,10 @@
           <w:bCs/>
           <w:b/>
         </w:rPr>
-        <w:t xml:space="preserve">pago real</w:t>
-      </w:r>
-      <w:r>
-        <w:t xml:space="preserve"> </w:t>
-      </w:r>
-      <w:r>
-        <w:t xml:space="preserve">(MODO o Mercado Pago) y el cálculo de envío por código postal.</w:t>
+        <w:t xml:space="preserve">pago es una simulación</w:t>
+      </w:r>
+      <w:r>
+        <w:t xml:space="preserve">: no se cobra nada. Para cobrar de verdad hay que integrar una pasarela de pago (MODO, Mercado Pago u otra) que tokenice la tarjeta y confirme la aprobación al servidor. Tampoco está el cálculo de envío por código postal.</w:t>
       </w:r>
     </w:p>
     <w:p>

</xml_diff>

<commit_message>
Documenta las imágenes de los productos
</commit_message>
<xml_diff>
--- a/docs/documentacion-tecnica.docx
+++ b/docs/documentacion-tecnica.docx
@@ -1249,7 +1249,37 @@
         <w:t xml:space="preserve">ImagenUrl</w:t>
       </w:r>
       <w:r>
-        <w:t xml:space="preserve">). Si el producto no tiene imagen, se muestra un ícono.</w:t>
+        <w:t xml:space="preserve">). Si el producto no tiene imagen, se muestra un ícono. Las fotos incluidas están en</w:t>
+      </w:r>
+      <w:r>
+        <w:t xml:space="preserve"> </w:t>
+      </w:r>
+      <w:r>
+        <w:rPr>
+          <w:rStyle w:val="VerbatimChar"/>
+        </w:rPr>
+        <w:t xml:space="preserve">public/img/productos/</w:t>
+      </w:r>
+      <w:r>
+        <w:t xml:space="preserve"> </w:t>
+      </w:r>
+      <w:r>
+        <w:t xml:space="preserve">y su dirección se carga en la base con</w:t>
+      </w:r>
+      <w:r>
+        <w:t xml:space="preserve"> </w:t>
+      </w:r>
+      <w:r>
+        <w:rPr>
+          <w:rStyle w:val="VerbatimChar"/>
+        </w:rPr>
+        <w:t xml:space="preserve">07_cargar_imagenes.sql</w:t>
+      </w:r>
+      <w:r>
+        <w:t xml:space="preserve"> </w:t>
+      </w:r>
+      <w:r>
+        <w:t xml:space="preserve">(o ya viene en el script principal). Las imágenes se muestran completas y centradas, sin recortes.</w:t>
       </w:r>
     </w:p>
     <w:p>

</xml_diff>